<commit_message>
feat: add DocxViewer component with custom branding and implement utility scripts to fix contract template data mapping
</commit_message>
<xml_diff>
--- a/public/contratos/Condiciones Específicas-Recursos Propios Menor de Edad.docx
+++ b/public/contratos/Condiciones Específicas-Recursos Propios Menor de Edad.docx
@@ -4434,14 +4434,7 @@
           <w:rFonts w:eastAsia="MS Mincho" w:cs="Calibri"/>
           <w:lang w:val="es-ES"/>
         </w:rPr>
-        <w:t>: Vinculación del CAMPER a empresas aliadas incluyendo salario, apoyos económicos, apoyos de sostenimiento, reconocimientos o beneficios asociados a procesos formativos, contratos de aprendizaje u otros esquemas válidamente estructurados por CAMPUSLANDS</w:t>
-      </w:r>
-      <w:r>
-        <w:rPr>
-          <w:rFonts w:eastAsia="MS Mincho" w:cs="Calibri"/>
-          <w:lang w:val="es-ES"/>
-        </w:rPr>
-        <w:t>.</w:t>
+        <w:t>: Vinculación del CAMPER a empresas aliadas incluyendo salario, apoyos económicos, apoyos de sostenimiento, reconocimientos o beneficios asociados a procesos formativos, contratos de aprendizaje u otros esquemas válidamente estructurados por CAMPUSLANDS.</w:t>
       </w:r>
     </w:p>
     <w:p>
@@ -6151,7 +6144,7 @@
           <w:bCs/>
           <w:lang w:val="es-ES"/>
         </w:rPr>
-        <w:t>{CORREO}</w:t>
+        <w:t>{EMAIL REP CAMPER}</w:t>
       </w:r>
     </w:p>
     <w:p>
@@ -6204,12 +6197,13 @@
           <w:bCs/>
           <w:lang w:val="es-ES"/>
         </w:rPr>
-        <w:t>{CELULAR REPRESENTANTE}</w:t>
-      </w:r>
-      <w:r>
-        <w:rPr>
-          <w:rFonts w:eastAsia="MS Mincho" w:cs="Calibri"/>
-          <w:b/>
+        <w:t>{TELEFONO REP CAMPER}</w:t>
+      </w:r>
+      <w:r>
+        <w:rPr>
+          <w:rFonts w:eastAsia="MS Mincho" w:cs="Calibri"/>
+          <w:b/>
+          <w:lang w:val="es-CO"/>
         </w:rPr>
         <w:t> </w:t>
       </w:r>
@@ -6528,7 +6522,7 @@
           <w:b/>
           <w:lang w:val="es-CO"/>
         </w:rPr>
-        <w:t>{CORREO}</w:t>
+        <w:t>{EMAIL REP CAMPER}</w:t>
       </w:r>
     </w:p>
     <w:p>
@@ -7367,12 +7361,27 @@
           <w:rFonts w:asciiTheme="minorHAnsi" w:eastAsia="Times New Roman" w:hAnsiTheme="minorHAnsi" w:cstheme="minorHAnsi"/>
           <w:lang w:val="es-CO"/>
         </w:rPr>
-        <w:t>: El CAMPER pagará a CAMPUSLANDS al momento de la suscripción del presente Contrato, la suma de TRECE MILLONES DE PESOS M/CTE ($13.000.000 COP). </w:t>
+        <w:t>: El CAMPER pagará a CAMPUSLANDS al momento de la suscripción del presente Contrato, la suma de {VALOR_TOTAL_LETRAS_UPPER} DE PESOS M/CTE ({VALOR_TOTAL_NUMEROS} COP). </w:t>
+      </w:r>
+      <w:r>
+        <w:rPr>
+          <w:rFonts w:asciiTheme="minorHAnsi" w:eastAsia="Times New Roman" w:hAnsiTheme="minorHAnsi" w:cstheme="minorHAnsi"/>
+          <w:lang w:val="es-CO"/>
+        </w:rPr>
+        <w:t xml:space="preserve"> Este pago </w:t>
+      </w:r>
+      <w:r>
+        <w:rPr>
+          <w:rFonts w:asciiTheme="minorHAnsi" w:eastAsia="Times New Roman" w:hAnsiTheme="minorHAnsi" w:cstheme="minorHAnsi"/>
+          <w:lang w:val="es-ES"/>
+        </w:rPr>
+        <w:t>deberá ser asumido en su totalidad por el CAMPER mediante recursos propios, de acuerdo con el siguiente cronograma de pagos:</w:t>
       </w:r>
     </w:p>
     <w:p>
       <w:pPr>
         <w:spacing w:before="100" w:beforeAutospacing="1" w:after="100" w:afterAutospacing="1" w:line="240" w:lineRule="auto"/>
+        <w:ind w:left="720"/>
         <w:jc w:val="both"/>
         <w:rPr>
           <w:rFonts w:asciiTheme="minorHAnsi" w:eastAsia="Times New Roman" w:hAnsiTheme="minorHAnsi" w:cstheme="minorHAnsi"/>
@@ -7382,13 +7391,42 @@
     </w:p>
     <w:p>
       <w:pPr>
-        <w:spacing w:before="100" w:beforeAutospacing="1" w:after="100" w:afterAutospacing="1" w:line="240" w:lineRule="auto"/>
-        <w:jc w:val="both"/>
-        <w:rPr>
-          <w:rFonts w:asciiTheme="minorHAnsi" w:eastAsia="Times New Roman" w:hAnsiTheme="minorHAnsi" w:cstheme="minorHAnsi"/>
-          <w:lang w:val="es-CO"/>
-        </w:rPr>
-      </w:pPr>
+        <w:ind w:left="360" w:hanging="360"/>
+      </w:pPr>
+      <w:r>
+        <w:t>{#CUOTAS_LIST}</w:t>
+      </w:r>
+    </w:p>
+    <w:p>
+      <w:pPr>
+        <w:ind w:left="360" w:hanging="360"/>
+      </w:pPr>
+      <w:r>
+        <w:rPr>
+          <w:b/>
+        </w:rPr>
+        <w:t>- {titulo} {valor}</w:t>
+      </w:r>
+      <w:r>
+        <w:t xml:space="preserve">{fecha_prefijo}</w:t>
+      </w:r>
+      <w:r>
+        <w:rPr>
+          <w:b/>
+        </w:rPr>
+        <w:t>{fecha_bold}</w:t>
+      </w:r>
+      <w:r>
+        <w:t xml:space="preserve">{fecha_sufijo}</w:t>
+      </w:r>
+    </w:p>
+    <w:p>
+      <w:pPr>
+        <w:ind w:left="360" w:hanging="360"/>
+      </w:pPr>
+      <w:r>
+        <w:t>{/CUOTAS_LIST}</w:t>
+      </w:r>
     </w:p>
     <w:p>
       <w:pPr>
@@ -7844,6 +7882,7 @@
           <w:b/>
           <w:lang w:val="es-ES"/>
         </w:rPr>
+        <w:lastRenderedPageBreak/>
         <w:t>APLICACIÓN DE PAGOS</w:t>
       </w:r>
       <w:r>
@@ -8274,6 +8313,7 @@
           <w:rFonts w:asciiTheme="minorHAnsi" w:eastAsia="Times New Roman" w:hAnsiTheme="minorHAnsi" w:cstheme="minorHAnsi"/>
           <w:lang w:val="es-ES"/>
         </w:rPr>
+        <w:lastRenderedPageBreak/>
         <w:t xml:space="preserve">En estos casos, el CAMPER estará obligado con el pago insoluto del valor del programa a CAMPUSLANDS. Razón por la cual, en ningún caso la expulsión dará lugar a devolución </w:t>
       </w:r>
     </w:p>
@@ -8415,27 +8455,7 @@
           <w:color w:val="4472C4" w:themeColor="accent5"/>
           <w:lang w:val="es-ES"/>
         </w:rPr>
-        <w:t>CLÁUSULA DÉCIMA</w:t>
-      </w:r>
-      <w:r>
-        <w:rPr>
-          <w:rFonts w:asciiTheme="minorHAnsi" w:eastAsia="Times New Roman" w:hAnsiTheme="minorHAnsi" w:cstheme="minorHAnsi"/>
-          <w:b/>
-          <w:bCs/>
-          <w:color w:val="4472C4" w:themeColor="accent5"/>
-          <w:lang w:val="es-ES"/>
-        </w:rPr>
-        <w:t xml:space="preserve"> PRIMERA</w:t>
-      </w:r>
-      <w:r>
-        <w:rPr>
-          <w:rFonts w:asciiTheme="minorHAnsi" w:eastAsia="Times New Roman" w:hAnsiTheme="minorHAnsi" w:cstheme="minorHAnsi"/>
-          <w:b/>
-          <w:bCs/>
-          <w:color w:val="4472C4" w:themeColor="accent5"/>
-          <w:lang w:val="es-ES"/>
-        </w:rPr>
-        <w:t>: DISPOSICIONES FINALES</w:t>
+        <w:t>CLÁUSULA DÉCIMA PRIMERA: DISPOSICIONES FINALES</w:t>
       </w:r>
     </w:p>
     <w:p>
@@ -8869,16 +8889,7 @@
           <w:bCs/>
           <w:lang w:val="es-CO"/>
         </w:rPr>
-        <w:t>NOMBRE DEL REPRESENTANTE LEGAL}</w:t>
-      </w:r>
-      <w:r>
-        <w:rPr>
-          <w:rFonts w:eastAsia="MS Mincho" w:cs="Calibri"/>
-          <w:b/>
-          <w:bCs/>
-          <w:lang w:val="es-CO"/>
-        </w:rPr>
-        <w:t xml:space="preserve"> </w:t>
+        <w:t xml:space="preserve">NOMBRE DEL REPRESENTANTE LEGAL} </w:t>
       </w:r>
       <w:r>
         <w:rPr>
@@ -9276,7 +9287,6 @@
           <w:b/>
           <w:lang w:val="es-MX"/>
         </w:rPr>
-        <w:lastRenderedPageBreak/>
         <w:t xml:space="preserve">PAGARÉ No. </w:t>
       </w:r>
       <w:r>
@@ -9909,7 +9919,6 @@
         <w:rPr>
           <w:lang w:val="es-CO"/>
         </w:rPr>
-        <w:lastRenderedPageBreak/>
         <w:t>Señores</w:t>
       </w:r>
     </w:p>
@@ -9918,11 +9927,13 @@
         <w:pStyle w:val="Sinespaciado"/>
         <w:rPr>
           <w:b/>
-        </w:rPr>
-      </w:pPr>
-      <w:r>
-        <w:rPr>
-          <w:b/>
+          <w:lang w:val="es-CO"/>
+        </w:rPr>
+      </w:pPr>
+      <w:r>
+        <w:rPr>
+          <w:b/>
+          <w:lang w:val="es-CO"/>
         </w:rPr>
         <w:t>CAMPUSLANDS S.A.S. BIC</w:t>
       </w:r>
@@ -9930,14 +9941,23 @@
     <w:p>
       <w:pPr>
         <w:pStyle w:val="Sinespaciado"/>
-      </w:pPr>
-      <w:r>
+        <w:rPr>
+          <w:lang w:val="es-CO"/>
+        </w:rPr>
+      </w:pPr>
+      <w:r>
+        <w:rPr>
+          <w:lang w:val="es-CO"/>
+        </w:rPr>
         <w:t>NIT. 901.628.406-1</w:t>
       </w:r>
     </w:p>
     <w:p>
       <w:pPr>
         <w:pStyle w:val="Sinespaciado"/>
+        <w:rPr>
+          <w:lang w:val="es-CO"/>
+        </w:rPr>
       </w:pPr>
     </w:p>
     <w:p>
@@ -10841,6 +10861,7 @@
           <w:rFonts w:asciiTheme="minorHAnsi" w:hAnsiTheme="minorHAnsi" w:cstheme="minorHAnsi"/>
           <w:lang w:val="es-MX"/>
         </w:rPr>
+        <w:lastRenderedPageBreak/>
         <w:t>_____________________________</w:t>
       </w:r>
     </w:p>
@@ -10963,7 +10984,6 @@
         <w:rPr>
           <w:lang w:val="es-CO"/>
         </w:rPr>
-        <w:lastRenderedPageBreak/>
         <w:t>Señores, </w:t>
       </w:r>
     </w:p>
@@ -12644,7 +12664,7 @@
   <w:abstractNum w:abstractNumId="10" w15:restartNumberingAfterBreak="0">
     <w:nsid w:val="2B0C1655"/>
     <w:multiLevelType w:val="multilevel"/>
-    <w:tmpl w:val="CCA6ACA2"/>
+    <w:tmpl w:val="3CAC19B8"/>
     <w:lvl w:ilvl="0">
       <w:start w:val="8"/>
       <w:numFmt w:val="decimal"/>
@@ -12657,17 +12677,18 @@
         <w:ind w:left="720" w:hanging="360"/>
       </w:pPr>
     </w:lvl>
-    <w:lvl w:ilvl="1" w:tentative="1">
-      <w:start w:val="1"/>
-      <w:numFmt w:val="decimal"/>
+    <w:lvl w:ilvl="1">
+      <w:start w:val="1"/>
+      <w:numFmt w:val="upperRoman"/>
       <w:lvlText w:val="%2."/>
       <w:lvlJc w:val="left"/>
       <w:pPr>
-        <w:tabs>
-          <w:tab w:val="num" w:pos="1440"/>
-        </w:tabs>
-        <w:ind w:left="1440" w:hanging="360"/>
-      </w:pPr>
+        <w:ind w:left="1800" w:hanging="720"/>
+      </w:pPr>
+      <w:rPr>
+        <w:rFonts w:hint="default"/>
+        <w:b/>
+      </w:rPr>
     </w:lvl>
     <w:lvl w:ilvl="2" w:tentative="1">
       <w:start w:val="1"/>
@@ -18374,6 +18395,7 @@
   <w:style w:type="character" w:default="1" w:styleId="Fuentedeprrafopredeter">
     <w:name w:val="Default Paragraph Font"/>
     <w:uiPriority w:val="1"/>
+    <w:semiHidden/>
     <w:unhideWhenUsed/>
   </w:style>
   <w:style w:type="table" w:default="1" w:styleId="Tablanormal">
@@ -18839,6 +18861,30 @@
 </file>
 
 <file path=customXml/item1.xml><?xml version="1.0" encoding="utf-8"?>
+<b:Sources xmlns:b="http://schemas.openxmlformats.org/officeDocument/2006/bibliography" xmlns="http://schemas.openxmlformats.org/officeDocument/2006/bibliography" SelectedStyle="\APASixthEditionOfficeOnline.xsl" StyleName="APA" Version="6"/>
+</file>
+
+<file path=customXml/item2.xml><?xml version="1.0" encoding="utf-8"?>
+<p:properties xmlns:p="http://schemas.microsoft.com/office/2006/metadata/properties" xmlns:xsi="http://www.w3.org/2001/XMLSchema-instance" xmlns:pc="http://schemas.microsoft.com/office/infopath/2007/PartnerControls">
+  <documentManagement>
+    <TaxCatchAll xmlns="ac3346e8-ab56-4c26-82c1-a6dbe4d50797" xsi:nil="true"/>
+    <lcf76f155ced4ddcb4097134ff3c332f xmlns="5eb19900-e524-44a7-a201-4128b189de66">
+      <Terms xmlns="http://schemas.microsoft.com/office/infopath/2007/PartnerControls"/>
+    </lcf76f155ced4ddcb4097134ff3c332f>
+  </documentManagement>
+</p:properties>
+</file>
+
+<file path=customXml/item3.xml><?xml version="1.0" encoding="utf-8"?>
+<?mso-contentType ?>
+<FormTemplates xmlns="http://schemas.microsoft.com/sharepoint/v3/contenttype/forms">
+  <Display>DocumentLibraryForm</Display>
+  <Edit>DocumentLibraryForm</Edit>
+  <New>DocumentLibraryForm</New>
+</FormTemplates>
+</file>
+
+<file path=customXml/item4.xml><?xml version="1.0" encoding="utf-8"?>
 <ct:contentTypeSchema xmlns:ct="http://schemas.microsoft.com/office/2006/metadata/contentType" xmlns:ma="http://schemas.microsoft.com/office/2006/metadata/properties/metaAttributes" ct:_="" ma:_="" ma:contentTypeName="Documento" ma:contentTypeID="0x0101003CF7B74BC486904F87A24230CF1021F4" ma:contentTypeVersion="13" ma:contentTypeDescription="Crear nuevo documento." ma:contentTypeScope="" ma:versionID="0f28f41e1845c113706e342c28e3d2d6">
   <xsd:schema xmlns:xsd="http://www.w3.org/2001/XMLSchema" xmlns:xs="http://www.w3.org/2001/XMLSchema" xmlns:p="http://schemas.microsoft.com/office/2006/metadata/properties" xmlns:ns2="5eb19900-e524-44a7-a201-4128b189de66" xmlns:ns3="ac3346e8-ab56-4c26-82c1-a6dbe4d50797" targetNamespace="http://schemas.microsoft.com/office/2006/metadata/properties" ma:root="true" ma:fieldsID="ae302aa1a2391b0106f5450afc039c50" ns2:_="" ns3:_="">
     <xsd:import namespace="5eb19900-e524-44a7-a201-4128b189de66"/>
@@ -19045,31 +19091,34 @@
 </ct:contentTypeSchema>
 </file>
 
-<file path=customXml/item2.xml><?xml version="1.0" encoding="utf-8"?>
-<?mso-contentType ?>
-<FormTemplates xmlns="http://schemas.microsoft.com/sharepoint/v3/contenttype/forms">
-  <Display>DocumentLibraryForm</Display>
-  <Edit>DocumentLibraryForm</Edit>
-  <New>DocumentLibraryForm</New>
-</FormTemplates>
+<file path=customXml/itemProps1.xml><?xml version="1.0" encoding="utf-8"?>
+<ds:datastoreItem xmlns:ds="http://schemas.openxmlformats.org/officeDocument/2006/customXml" ds:itemID="{220309CC-7FC7-4EC7-829B-F2B3170B9030}">
+  <ds:schemaRefs>
+    <ds:schemaRef ds:uri="http://schemas.openxmlformats.org/officeDocument/2006/bibliography"/>
+  </ds:schemaRefs>
+</ds:datastoreItem>
 </file>
 
-<file path=customXml/item3.xml><?xml version="1.0" encoding="utf-8"?>
-<p:properties xmlns:p="http://schemas.microsoft.com/office/2006/metadata/properties" xmlns:xsi="http://www.w3.org/2001/XMLSchema-instance" xmlns:pc="http://schemas.microsoft.com/office/infopath/2007/PartnerControls">
-  <documentManagement>
-    <TaxCatchAll xmlns="ac3346e8-ab56-4c26-82c1-a6dbe4d50797" xsi:nil="true"/>
-    <lcf76f155ced4ddcb4097134ff3c332f xmlns="5eb19900-e524-44a7-a201-4128b189de66">
-      <Terms xmlns="http://schemas.microsoft.com/office/infopath/2007/PartnerControls"/>
-    </lcf76f155ced4ddcb4097134ff3c332f>
-  </documentManagement>
-</p:properties>
+<file path=customXml/itemProps2.xml><?xml version="1.0" encoding="utf-8"?>
+<ds:datastoreItem xmlns:ds="http://schemas.openxmlformats.org/officeDocument/2006/customXml" ds:itemID="{ACE41FA6-99B4-4093-93B1-FE51D0DEC8E4}">
+  <ds:schemaRefs>
+    <ds:schemaRef ds:uri="http://schemas.microsoft.com/office/2006/metadata/properties"/>
+    <ds:schemaRef ds:uri="http://schemas.microsoft.com/office/infopath/2007/PartnerControls"/>
+    <ds:schemaRef ds:uri="ac3346e8-ab56-4c26-82c1-a6dbe4d50797"/>
+    <ds:schemaRef ds:uri="5eb19900-e524-44a7-a201-4128b189de66"/>
+  </ds:schemaRefs>
+</ds:datastoreItem>
 </file>
 
-<file path=customXml/item4.xml><?xml version="1.0" encoding="utf-8"?>
-<b:Sources xmlns:b="http://schemas.openxmlformats.org/officeDocument/2006/bibliography" xmlns="http://schemas.openxmlformats.org/officeDocument/2006/bibliography" SelectedStyle="\APASixthEditionOfficeOnline.xsl" StyleName="APA" Version="6"/>
+<file path=customXml/itemProps3.xml><?xml version="1.0" encoding="utf-8"?>
+<ds:datastoreItem xmlns:ds="http://schemas.openxmlformats.org/officeDocument/2006/customXml" ds:itemID="{E7C9EEC2-CC57-4CC8-9639-F6DBAD4FE65A}">
+  <ds:schemaRefs>
+    <ds:schemaRef ds:uri="http://schemas.microsoft.com/sharepoint/v3/contenttype/forms"/>
+  </ds:schemaRefs>
+</ds:datastoreItem>
 </file>
 
-<file path=customXml/itemProps1.xml><?xml version="1.0" encoding="utf-8"?>
+<file path=customXml/itemProps4.xml><?xml version="1.0" encoding="utf-8"?>
 <ds:datastoreItem xmlns:ds="http://schemas.openxmlformats.org/officeDocument/2006/customXml" ds:itemID="{C5DCF7A7-CEF9-4327-9CCD-BB028971F589}">
   <ds:schemaRefs>
     <ds:schemaRef ds:uri="http://schemas.microsoft.com/office/2006/metadata/contentType"/>
@@ -19086,31 +19135,4 @@
     <ds:schemaRef ds:uri="http://schemas.microsoft.com/internal/obd"/>
   </ds:schemaRefs>
 </ds:datastoreItem>
-</file>
-
-<file path=customXml/itemProps2.xml><?xml version="1.0" encoding="utf-8"?>
-<ds:datastoreItem xmlns:ds="http://schemas.openxmlformats.org/officeDocument/2006/customXml" ds:itemID="{E7C9EEC2-CC57-4CC8-9639-F6DBAD4FE65A}">
-  <ds:schemaRefs>
-    <ds:schemaRef ds:uri="http://schemas.microsoft.com/sharepoint/v3/contenttype/forms"/>
-  </ds:schemaRefs>
-</ds:datastoreItem>
-</file>
-
-<file path=customXml/itemProps3.xml><?xml version="1.0" encoding="utf-8"?>
-<ds:datastoreItem xmlns:ds="http://schemas.openxmlformats.org/officeDocument/2006/customXml" ds:itemID="{ACE41FA6-99B4-4093-93B1-FE51D0DEC8E4}">
-  <ds:schemaRefs>
-    <ds:schemaRef ds:uri="http://schemas.microsoft.com/office/2006/metadata/properties"/>
-    <ds:schemaRef ds:uri="http://schemas.microsoft.com/office/infopath/2007/PartnerControls"/>
-    <ds:schemaRef ds:uri="ac3346e8-ab56-4c26-82c1-a6dbe4d50797"/>
-    <ds:schemaRef ds:uri="5eb19900-e524-44a7-a201-4128b189de66"/>
-  </ds:schemaRefs>
-</ds:datastoreItem>
-</file>
-
-<file path=customXml/itemProps4.xml><?xml version="1.0" encoding="utf-8"?>
-<ds:datastoreItem xmlns:ds="http://schemas.openxmlformats.org/officeDocument/2006/customXml" ds:itemID="{220309CC-7FC7-4EC7-829B-F2B3170B9030}">
-  <ds:schemaRefs>
-    <ds:schemaRef ds:uri="http://schemas.openxmlformats.org/officeDocument/2006/bibliography"/>
-  </ds:schemaRefs>
-</ds:datastoreItem>
 </file>
</xml_diff>